<commit_message>
Use benchmark scenario terminology
Co-authored-by: Copilot <223556219+Copilot@users.noreply.github.com>
</commit_message>
<xml_diff>
--- a/docs/evaluations/azure-sdk-agent-friendliness/2026-09-01.docx
+++ b/docs/evaluations/azure-sdk-agent-friendliness/2026-09-01.docx
@@ -224,28 +224,28 @@
         <w:pStyle w:val="Heading3"/>
       </w:pPr>
       <w:r>
-        <w:t>Prompt set</w:t>
+        <w:t>Benchmark scenarios</w:t>
       </w:r>
       <w:r/>
     </w:p>
     <w:p>
       <w:r/>
       <w:r>
-        <w:t>The multi-service prompts cover authentication, client setup, CRUD, pagination, error handling, retries, polling, batch operations, messaging, and event processing across data-plane and management-plane SDKs.</w:t>
+        <w:t>The multi-service scenarios cover authentication, client setup, CRUD, pagination, error handling, retries, polling, batch operations, messaging, and event processing across data-plane and management-plane SDKs.</w:t>
       </w:r>
       <w:r/>
     </w:p>
     <w:p>
       <w:r/>
       <w:r>
-        <w:t>The Foundry prompts cover agent lifecycle, file search, function tools, project resource discovery, dataset lifecycle, evaluation runs, text translation and transliteration, and single-document and batch document translation.</w:t>
+        <w:t>The Foundry scenarios cover agent lifecycle, file search, function tools, project resource discovery, dataset lifecycle, evaluation runs, text translation and transliteration, and single-document and batch document translation.</w:t>
       </w:r>
       <w:r/>
     </w:p>
     <w:p>
       <w:r/>
       <w:r>
-        <w:t>All prompts request complete projects, testing end-to-end developer tasks rather than isolated API calls.</w:t>
+        <w:t>Each scenario requests a complete project, testing an end-to-end developer task rather than isolated API calls.</w:t>
       </w:r>
       <w:r/>
     </w:p>
@@ -261,7 +261,7 @@
     <w:p>
       <w:r/>
       <w:r>
-        <w:t xml:space="preserve">Each item in a prompt's </w:t>
+        <w:t>Each benchmark scenario defines independent requirements in its</w:t>
       </w:r>
       <w:r>
         <w:rPr>
@@ -270,7 +270,7 @@
         <w:t>## Evaluation Criteria</w:t>
       </w:r>
       <w:r>
-        <w:t xml:space="preserve"> is an independent requirement. An LLM reviewer checks the generated project for the requested packages, clients, authentication, operations, and error handling. These checks measure task completion and API usability.</w:t>
+        <w:t xml:space="preserve"> section. An LLM reviewer checks the generated project for the requested packages, clients, authentication, operations, and error handling. These checks measure task completion and API usability.</w:t>
       </w:r>
       <w:r/>
     </w:p>
@@ -465,7 +465,7 @@
           </w:tcPr>
           <w:p>
             <w:r>
-              <w:t>Task-specific requirements from the prompt, such as using the requested package, client, API, authentication method, or SDK operation.</w:t>
+              <w:t>Scenario-specific requirements, such as using the requested package, client, API, authentication method, or SDK operation.</w:t>
             </w:r>
           </w:p>
         </w:tc>
@@ -575,7 +575,7 @@
     <w:p>
       <w:r/>
       <w:r>
-        <w:t>Prompt, Language, and Program Checks remain separate. Skipped checks are excluded, and infrastructure failures are reported separately. Cross-language totals are informational because prompt and criteria inventories differ.</w:t>
+        <w:t>Prompt, Language, and Program Checks remain separate. Skipped checks are excluded, and infrastructure failures are reported separately. Cross-language totals are informational because scenario and criteria inventories differ.</w:t>
       </w:r>
       <w:r/>
     </w:p>
@@ -597,7 +597,7 @@
       </w:pPr>
       <w:r/>
       <w:r>
-        <w:t>This benchmark is one data point. Each prompt runs once per configuration, and LLM-reviewed checks are nondeterministic.</w:t>
+        <w:t>This benchmark is one data point. Each scenario runs once per configuration, and LLM-reviewed checks are nondeterministic.</w:t>
       </w:r>
       <w:r/>
     </w:p>
@@ -609,7 +609,7 @@
       </w:pPr>
       <w:r/>
       <w:r>
-        <w:t>Many prompts specify the expected package, client, or SDK pattern. Results are stronger evidence of implementation than independent API discovery.</w:t>
+        <w:t>Many scenarios specify the expected package, client, or SDK pattern. Results are stronger evidence of implementation than independent API discovery.</w:t>
       </w:r>
       <w:r/>
     </w:p>
@@ -633,7 +633,7 @@
       </w:pPr>
       <w:r/>
       <w:r>
-        <w:t>Prompt inventories differ by language and cover common tasks rather than every library or usage pattern.</w:t>
+        <w:t>Scenario inventories differ by language and cover common tasks rather than every library or usage pattern.</w:t>
       </w:r>
       <w:r/>
     </w:p>

</xml_diff>